<commit_message>
Polish resume site QA and career target
</commit_message>
<xml_diff>
--- a/docs/Luke_Lavender_Resume.docx
+++ b/docs/Luke_Lavender_Resume.docx
@@ -47,11 +47,7 @@
         <w:spacing w:after="80"/>
       </w:pPr>
       <w:r>
-        <w:rPr>
-          <w:sz w:val="20"/>
-          <w:szCs w:val="20"/>
-        </w:rPr>
-        <w:t xml:space="preserve">Infrastructure, network operations, Windows domains, Linux administration, traveling field IT, datacenter support, application support, and business systems. I came up through real installs, messy sites, family-business problems, and production environments, and I am looking for a full-time technical role where I can stay close to infrastructure, operations, and practical problem solving.</w:t>
+        <w:t>Infrastructure, network operations, Windows domains, Linux administration, traveling field IT, Data Center support, application support, and business systems. I came up through real installs, messy sites, family-business problems, and production environments. I am seeking a full-time salaried employee role with benefits, long-term ownership, and full professional focus; PAFDS Technologies remains available for side work, but I am not looking for contract placement.</w:t>
       </w:r>
     </w:p>
     <w:p>
@@ -313,27 +309,27 @@
           <w:szCs w:val="22"/>
           <w:color w:val="101719"/>
         </w:rPr>
-        <w:t xml:space="preserve">Datacenter Technician - EOS IT Solutions / Meta | Jan 2025 - Mar 2025</w:t>
-      </w:r>
-    </w:p>
-    <w:p>
-      <w:pPr>
-        <w:spacing w:after="45"/>
-        <w:ind w:left="360" w:hanging="180"/>
-      </w:pPr>
-      <w:r>
-        <w:rPr>
-          <w:sz w:val="20"/>
-          <w:szCs w:val="20"/>
-        </w:rPr>
-        <w:t xml:space="preserve">- </w:t>
-      </w:r>
-      <w:r>
-        <w:rPr>
-          <w:sz w:val="20"/>
-          <w:szCs w:val="20"/>
-        </w:rPr>
-        <w:t xml:space="preserve">Worked in high-quality datacenter facilities on rack/stack, cabling, labeling, hardware checks, break/fix, RMAs, ticket updates, ETAs, and handoffs.</w:t>
+        <w:t xml:space="preserve">Data Center Technician - EOS IT Solutions / Meta | Jan 2025 - Mar 2025</w:t>
+      </w:r>
+    </w:p>
+    <w:p>
+      <w:pPr>
+        <w:spacing w:after="45"/>
+        <w:ind w:left="360" w:hanging="180"/>
+      </w:pPr>
+      <w:r>
+        <w:rPr>
+          <w:sz w:val="20"/>
+          <w:szCs w:val="20"/>
+        </w:rPr>
+        <w:t xml:space="preserve">- </w:t>
+      </w:r>
+      <w:r>
+        <w:rPr>
+          <w:sz w:val="20"/>
+          <w:szCs w:val="20"/>
+        </w:rPr>
+        <w:t xml:space="preserve">Worked in high-quality Data Center facilities on rack/stack, cabling, labeling, hardware checks, break/fix, RMAs, ticket updates, ETAs, and handoffs.</w:t>
       </w:r>
     </w:p>
     <w:p>
@@ -461,27 +457,27 @@
           <w:sz w:val="20"/>
           <w:szCs w:val="20"/>
         </w:rPr>
-        <w:t xml:space="preserve">Supported isolated Active Directory domains in remote areas and traveled to branch offices, datacenters, disaster-recovery environments, and power stations.</w:t>
-      </w:r>
-    </w:p>
-    <w:p>
-      <w:pPr>
-        <w:spacing w:after="45"/>
-        <w:ind w:left="360" w:hanging="180"/>
-      </w:pPr>
-      <w:r>
-        <w:rPr>
-          <w:sz w:val="20"/>
-          <w:szCs w:val="20"/>
-        </w:rPr>
-        <w:t xml:space="preserve">- </w:t>
-      </w:r>
-      <w:r>
-        <w:rPr>
-          <w:sz w:val="20"/>
-          <w:szCs w:val="20"/>
-        </w:rPr>
-        <w:t xml:space="preserve">Built strong interest in power operations, environmental impact, grid demand, electric vehicles, datacenter power needs, and resilient infrastructure.</w:t>
+        <w:t xml:space="preserve">Supported isolated Active Directory domains in remote areas and traveled to branch offices, Data Centers, disaster-recovery environments, and power stations.</w:t>
+      </w:r>
+    </w:p>
+    <w:p>
+      <w:pPr>
+        <w:spacing w:after="45"/>
+        <w:ind w:left="360" w:hanging="180"/>
+      </w:pPr>
+      <w:r>
+        <w:rPr>
+          <w:sz w:val="20"/>
+          <w:szCs w:val="20"/>
+        </w:rPr>
+        <w:t xml:space="preserve">- </w:t>
+      </w:r>
+      <w:r>
+        <w:rPr>
+          <w:sz w:val="20"/>
+          <w:szCs w:val="20"/>
+        </w:rPr>
+        <w:t xml:space="preserve">Built strong interest in power operations, environmental impact, grid demand, electric vehicles, Data Center power needs, and resilient infrastructure.</w:t>
       </w:r>
     </w:p>
     <w:p>
@@ -569,27 +565,27 @@
           <w:sz w:val="20"/>
           <w:szCs w:val="20"/>
         </w:rPr>
-        <w:t xml:space="preserve">Worked at MRC Global under an HCL Technologies contract before joining Network Innovation Solutions, adding enterprise datacenter support to the path between field work and larger-company IT standards.</w:t>
-      </w:r>
-    </w:p>
-    <w:p>
-      <w:pPr>
-        <w:spacing w:after="45"/>
-        <w:ind w:left="360" w:hanging="180"/>
-      </w:pPr>
-      <w:r>
-        <w:rPr>
-          <w:sz w:val="20"/>
-          <w:szCs w:val="20"/>
-        </w:rPr>
-        <w:t xml:space="preserve">- </w:t>
-      </w:r>
-      <w:r>
-        <w:rPr>
-          <w:sz w:val="20"/>
-          <w:szCs w:val="20"/>
-        </w:rPr>
-        <w:t xml:space="preserve">Supported datacenter hands-and-feet work, rack maintenance, cable cleanup, fiber/structured cabling, tape server care, and controlled-environment hardware support.</w:t>
+        <w:t xml:space="preserve">Worked at MRC Global under an HCL Technologies contract before joining Network Innovation Solutions, adding enterprise Data Center support to the path between field work and larger-company IT standards.</w:t>
+      </w:r>
+    </w:p>
+    <w:p>
+      <w:pPr>
+        <w:spacing w:after="45"/>
+        <w:ind w:left="360" w:hanging="180"/>
+      </w:pPr>
+      <w:r>
+        <w:rPr>
+          <w:sz w:val="20"/>
+          <w:szCs w:val="20"/>
+        </w:rPr>
+        <w:t xml:space="preserve">- </w:t>
+      </w:r>
+      <w:r>
+        <w:rPr>
+          <w:sz w:val="20"/>
+          <w:szCs w:val="20"/>
+        </w:rPr>
+        <w:t xml:space="preserve">Supported Data Center hands-and-feet work, rack maintenance, cable cleanup, fiber/structured cabling, tape server care, and controlled-environment hardware support.</w:t>
       </w:r>
     </w:p>
     <w:p>
@@ -836,7 +832,7 @@
           <w:sz w:val="20"/>
           <w:szCs w:val="20"/>
         </w:rPr>
-        <w:t xml:space="preserve">NetApp and e-waste: Reused decommissioned enterprise storage from a colo datacenter, handled firmware/licensing/vendor-resource friction through legitimate professional IT access, and turned equipment that could have become waste into a real learning and production platform.</w:t>
+        <w:t xml:space="preserve">NetApp and e-waste: Reused decommissioned enterprise storage from a colocation Data Center, handled firmware/licensing/vendor-resource friction through legitimate professional IT access, and turned equipment that could have become waste into a real learning and production platform.</w:t>
       </w:r>
     </w:p>
     <w:p>
@@ -876,7 +872,7 @@
           <w:sz w:val="20"/>
           <w:szCs w:val="20"/>
         </w:rPr>
-        <w:t xml:space="preserve">Public photo proof: LukeLavender.com/photos.html shows field work, rack deployments, datacenter/server exposure, Project Generals media, and redacted public proof images with context.</w:t>
+        <w:t xml:space="preserve">Public photo proof: LukeLavender.com/photos.html shows field work, rack deployments, Data Center and server room exposure, Project Generals media, and redacted public proof images with context.</w:t>
       </w:r>
     </w:p>
     <w:p>

</xml_diff>

<commit_message>
Add independent contractor project section
</commit_message>
<xml_diff>
--- a/docs/Luke_Lavender_Resume.docx
+++ b/docs/Luke_Lavender_Resume.docx
@@ -619,7 +619,7 @@
           <w:sz w:val="20"/>
           <w:szCs w:val="20"/>
         </w:rPr>
-        <w:t xml:space="preserve">Flew across the U.S. for Arby's end-to-end POS refreshes and retail-site installs, including racks, switches, firewalls, wiring, POS equipment, cable management, cutover support, validation, and closeout.</w:t>
+        <w:t xml:space="preserve">Assisted Zolarix on an Arby's install, performed well enough to be invited into many more Arby's projects, and then flew across the U.S. for end-to-end POS refreshes and retail-site installs, including racks, switches, firewalls, wiring, POS equipment, cable management, cutover support, validation, and closeout.</w:t>
       </w:r>
     </w:p>
     <w:p>
@@ -721,27 +721,27 @@
           <w:sz w:val="20"/>
           <w:szCs w:val="20"/>
         </w:rPr>
-        <w:t xml:space="preserve">Completed workstation upgrades, nurse cart deployments, WAP deployments, hospice-environment support, COVID-era workstation refreshes, public-safety site support, and IT deployment labor across many environments.</w:t>
-      </w:r>
-    </w:p>
-    <w:p>
-      <w:pPr>
-        <w:spacing w:after="45"/>
-        <w:ind w:left="360" w:hanging="180"/>
-      </w:pPr>
-      <w:r>
-        <w:rPr>
-          <w:sz w:val="20"/>
-          <w:szCs w:val="20"/>
-        </w:rPr>
-        <w:t xml:space="preserve">- </w:t>
-      </w:r>
-      <w:r>
-        <w:rPr>
-          <w:sz w:val="20"/>
-          <w:szCs w:val="20"/>
-        </w:rPr>
-        <w:t xml:space="preserve">Worked mostly through Field Nation, also used Upwork and WorkMarket, and brought trusted friends as assistants for larger onsite jobs while staying accountable for the work.</w:t>
+        <w:t xml:space="preserve">Completed workstation upgrades, nurse cart deployments, WAP deployments, hospice-environment support, COVID-era workstation refreshes, public-safety site support, AEP branch-office laptop/workstation deployments, Thermo Fisher workstation refresh work, U.S. Army Charleston-area WAP deployment work, industrial-shop and warehouse support around Nitro and Charleston industrial parks, and IT deployment labor across many environments.</w:t>
+      </w:r>
+    </w:p>
+    <w:p>
+      <w:pPr>
+        <w:spacing w:after="45"/>
+        <w:ind w:left="360" w:hanging="180"/>
+      </w:pPr>
+      <w:r>
+        <w:rPr>
+          <w:sz w:val="20"/>
+          <w:szCs w:val="20"/>
+        </w:rPr>
+        <w:t xml:space="preserve">- </w:t>
+      </w:r>
+      <w:r>
+        <w:rPr>
+          <w:sz w:val="20"/>
+          <w:szCs w:val="20"/>
+        </w:rPr>
+        <w:t xml:space="preserve">Worked mostly through Field Nation, also used Upwork and WorkMarket, and brought trusted friends as assistants for larger onsite jobs while staying accountable for the work; learned practical lessons about scope, reliability, documentation, communication, role fit, and knowing why someone is being brought onto a job.</w:t>
       </w:r>
     </w:p>
     <w:p>
@@ -833,6 +833,26 @@
           <w:szCs w:val="20"/>
         </w:rPr>
         <w:t xml:space="preserve">NetApp and e-waste: Reused decommissioned enterprise storage from a colocation Data Center, handled firmware/licensing/vendor-resource friction through legitimate professional IT access, and turned equipment that could have become waste into a real learning and production platform.</w:t>
+      </w:r>
+    </w:p>
+    <w:p>
+      <w:pPr>
+        <w:spacing w:after="45"/>
+        <w:ind w:left="360" w:hanging="180"/>
+      </w:pPr>
+      <w:r>
+        <w:rPr>
+          <w:sz w:val="20"/>
+          <w:szCs w:val="20"/>
+        </w:rPr>
+        <w:t xml:space="preserve">- </w:t>
+      </w:r>
+      <w:r>
+        <w:rPr>
+          <w:sz w:val="20"/>
+          <w:szCs w:val="20"/>
+        </w:rPr>
+        <w:t xml:space="preserve">Independent-contractor project examples: Thermo Fisher Scientific workstation refresh work, U.S. Army Charleston-area WAP deployment including AP installation supporting airfield operations, AEP branch-office laptop deployments to linemen and workstation refreshes, industrial-shop and warehouse support around Nitro and Charleston industrial parks for Zebra printers, WAPs, structured cabling, and workstation refreshes, contractor assistant/role-fit lessons from larger onsite jobs, and Zolarix/Arby's rollout work that grew from one assisted install into repeated national POS refresh work.</w:t>
       </w:r>
     </w:p>
     <w:p>

</xml_diff>

<commit_message>
Clarify fast food contractor progression
</commit_message>
<xml_diff>
--- a/docs/Luke_Lavender_Resume.docx
+++ b/docs/Luke_Lavender_Resume.docx
@@ -619,7 +619,7 @@
           <w:sz w:val="20"/>
           <w:szCs w:val="20"/>
         </w:rPr>
-        <w:t xml:space="preserve">Assisted Zolarix on an Arby's install, performed well enough to be invited into many more Arby's projects, and then flew across the U.S. for end-to-end POS refreshes and retail-site installs, including racks, switches, firewalls, wiring, POS equipment, cable management, cutover support, validation, and closeout.</w:t>
+        <w:t xml:space="preserve">Early fast-food tracking-system and POS installation work led into Arby's projects, Arby's led to Zolarix, and Zolarix expanded the work into national end-to-end POS refreshes with more exposure to project leads and decision-makers. Flew across the U.S. for retail-site installs including racks, switches, firewalls, wiring, POS equipment, cable management, cutover support, validation, and closeout.</w:t>
       </w:r>
     </w:p>
     <w:p>
@@ -721,7 +721,7 @@
           <w:sz w:val="20"/>
           <w:szCs w:val="20"/>
         </w:rPr>
-        <w:t xml:space="preserve">Completed workstation upgrades, nurse cart deployments, WAP deployments, hospice-environment support, COVID-era workstation refreshes, public-safety site support, AEP branch-office laptop/workstation deployments, Thermo Fisher workstation refresh work, U.S. Army Charleston-area WAP deployment work, industrial-shop and warehouse support around Nitro and Charleston industrial parks, and IT deployment labor across many environments.</w:t>
+        <w:t xml:space="preserve">Completed fast-food tracking-system installations, workstation upgrades, nurse cart deployments, WAP deployments, hospice-environment support, COVID-era workstation refreshes, public-safety site support, AEP branch-office laptop/workstation deployments, Thermo Fisher workstation refresh work, U.S. Army Charleston-area WAP deployment work, industrial-shop and warehouse support around Nitro and Charleston industrial parks, and IT deployment labor across many environments.</w:t>
       </w:r>
     </w:p>
     <w:p>
@@ -852,7 +852,7 @@
           <w:sz w:val="20"/>
           <w:szCs w:val="20"/>
         </w:rPr>
-        <w:t xml:space="preserve">Independent-contractor project examples: Thermo Fisher Scientific workstation refresh work, U.S. Army Charleston-area WAP deployment including AP installation supporting airfield operations, AEP branch-office laptop deployments to linemen and workstation refreshes, industrial-shop and warehouse support around Nitro and Charleston industrial parks for Zebra printers, WAPs, structured cabling, and workstation refreshes, contractor assistant/role-fit lessons from larger onsite jobs, and Zolarix/Arby's rollout work that grew from one assisted install into repeated national POS refresh work.</w:t>
+        <w:t xml:space="preserve">Independent-contractor project examples: fast-food tracking-system installations that led into Arby's work, Thermo Fisher Scientific workstation refresh work, U.S. Army Charleston-area WAP deployment including AP installation supporting airfield operations, AEP branch-office laptop deployments to linemen and workstation refreshes, industrial-shop and warehouse support around Nitro and Charleston industrial parks for Zebra printers, WAPs, structured cabling, and workstation refreshes, contractor assistant/role-fit lessons from larger onsite jobs, and Zolarix/Arby's rollout work that grew from Arby's performance into repeated national POS refresh work with more exposure to project leads and decision-makers.</w:t>
       </w:r>
     </w:p>
     <w:p>

</xml_diff>

<commit_message>
Update resume chronology and PAFDS side-work language
</commit_message>
<xml_diff>
--- a/docs/Luke_Lavender_Resume.docx
+++ b/docs/Luke_Lavender_Resume.docx
@@ -1,6 +1,6 @@
 
 <file path=word/document.xml><?xml version="1.0" encoding="utf-8"?>
-<w:document xmlns:w="http://schemas.openxmlformats.org/wordprocessingml/2006/main" xmlns:r="http://schemas.openxmlformats.org/officeDocument/2006/relationships">
+<w:document xmlns:w="http://schemas.openxmlformats.org/wordprocessingml/2006/main">
   <w:body>
     <w:p>
       <w:pPr>
@@ -47,7 +47,7 @@
         <w:spacing w:after="80"/>
       </w:pPr>
       <w:r>
-        <w:t>Infrastructure, network operations, Windows domains, Linux administration, traveling field IT, Data Center support, application support, and business systems. I came up through real installs, messy sites, family-business problems, and production environments. I am seeking a full-time salaried employee role with benefits, long-term ownership, and full professional focus; PAFDS Technologies remains available for side work, but I am not looking for contract placement.</w:t>
+        <w:t>Infrastructure, network operations, Windows domains, Linux administration, traveling field IT, Data Center support, application support, and business systems. I came up through real installs, messy sites, family-business problems, and production environments. I am seeking a full-time salaried employee role with benefits, long-term ownership, and full professional focus; PAFDS Technologies is maintained as side work and will not interrupt full-time employment.</w:t>
       </w:r>
     </w:p>
     <w:p>
@@ -215,27 +215,27 @@
           <w:szCs w:val="22"/>
           <w:color w:val="101719"/>
         </w:rPr>
-        <w:t xml:space="preserve">Keith's Kitchens Technology Operations / PAFDS Technologies | 2016 - Present</w:t>
-      </w:r>
-    </w:p>
-    <w:p>
-      <w:pPr>
-        <w:spacing w:after="45"/>
-        <w:ind w:left="360" w:hanging="180"/>
-      </w:pPr>
-      <w:r>
-        <w:rPr>
-          <w:sz w:val="20"/>
-          <w:szCs w:val="20"/>
-        </w:rPr>
-        <w:t xml:space="preserve">- </w:t>
-      </w:r>
-      <w:r>
-        <w:rPr>
-          <w:sz w:val="20"/>
-          <w:szCs w:val="20"/>
-        </w:rPr>
-        <w:t xml:space="preserve">Started around Keith's Kitchens as soon as legally able to work and grew from family-business technology support into current operations support.</w:t>
+        <w:t xml:space="preserve">Keith's Kitchens Technology Operations | Mar 2025 - Present</w:t>
+      </w:r>
+    </w:p>
+    <w:p>
+      <w:pPr>
+        <w:spacing w:after="45"/>
+        <w:ind w:left="360" w:hanging="180"/>
+      </w:pPr>
+      <w:r>
+        <w:rPr>
+          <w:sz w:val="20"/>
+          <w:szCs w:val="20"/>
+        </w:rPr>
+        <w:t xml:space="preserve">- After the Meta assignment ended in Mar 2025, returned to Keith's Kitchens as the current day-to-day technology operations focus; long-running Keith's Kitchens support began in 2016.</w:t>
+      </w:r>
+      <w:r>
+        <w:rPr>
+          <w:sz w:val="20"/>
+          <w:szCs w:val="20"/>
+        </w:rPr>
+        <w:t xml:space="preserve"/>
       </w:r>
     </w:p>
     <w:p>
@@ -268,14 +268,14 @@
           <w:sz w:val="20"/>
           <w:szCs w:val="20"/>
         </w:rPr>
-        <w:t xml:space="preserve">- </w:t>
-      </w:r>
-      <w:r>
-        <w:rPr>
-          <w:sz w:val="20"/>
-          <w:szCs w:val="20"/>
-        </w:rPr>
-        <w:t xml:space="preserve">Helped grow Doors2Go from a Keith's Kitchens shop resource into a business channel by connecting shop knowledge, customer questions, documentation, and practical digital workflows.</w:t>
+        <w:t xml:space="preserve">- PAFDS Technologies has been maintained since 2017 as side work outside full-time employment and will not interrupt a full-time employee role.</w:t>
+      </w:r>
+      <w:r>
+        <w:rPr>
+          <w:sz w:val="20"/>
+          <w:szCs w:val="20"/>
+        </w:rPr>
+        <w:t xml:space="preserve"/>
       </w:r>
     </w:p>
     <w:p>

</xml_diff>

<commit_message>
Correct Keith's Kitchens resume tenure
</commit_message>
<xml_diff>
--- a/docs/Luke_Lavender_Resume.docx
+++ b/docs/Luke_Lavender_Resume.docx
@@ -215,20 +215,20 @@
           <w:szCs w:val="22"/>
           <w:color w:val="101719"/>
         </w:rPr>
-        <w:t xml:space="preserve">Keith's Kitchens Technology Operations | Mar 2025 - Present</w:t>
-      </w:r>
-    </w:p>
-    <w:p>
-      <w:pPr>
-        <w:spacing w:after="45"/>
-        <w:ind w:left="360" w:hanging="180"/>
-      </w:pPr>
-      <w:r>
-        <w:rPr>
-          <w:sz w:val="20"/>
-          <w:szCs w:val="20"/>
-        </w:rPr>
-        <w:t xml:space="preserve">- After the Meta assignment ended in Mar 2025, returned to Keith's Kitchens as the current day-to-day technology operations focus; long-running Keith's Kitchens support began in 2016.</w:t>
+        <w:t xml:space="preserve">Keith's Kitchens Technology Operations | 2016 - Present</w:t>
+      </w:r>
+    </w:p>
+    <w:p>
+      <w:pPr>
+        <w:spacing w:after="45"/>
+        <w:ind w:left="360" w:hanging="180"/>
+      </w:pPr>
+      <w:r>
+        <w:rPr>
+          <w:sz w:val="20"/>
+          <w:szCs w:val="20"/>
+        </w:rPr>
+        <w:t xml:space="preserve">- Continuous Keith's Kitchens technology support since 2016; after the Meta assignment ended in Mar 2025, it became the current day-to-day technology operations focus.</w:t>
       </w:r>
       <w:r>
         <w:rPr>

</xml_diff>